<commit_message>
Update Detailed Report and Executive Summary drafts
Co-Authored-By: Claude Opus 5.5 <noreply@anthropic.com>
Claude-Session: https://claude.ai/code/session_013wkjbegxF5NBg4tVwAs8nd
</commit_message>
<xml_diff>
--- a/Group5_KashavPiya_WS6.4_ExecutiveSummary.docx
+++ b/Group5_KashavPiya_WS6.4_ExecutiveSummary.docx
@@ -5,7 +5,7 @@
     <w:p>
       <w:pPr>
         <w:spacing w:after="0" w:line="480" w:lineRule="auto"/>
-        <w:jc w:val="both"/>
+        <w:jc w:val="center"/>
         <w:rPr>
           <w:rFonts w:ascii="Times New Roman" w:eastAsiaTheme="majorEastAsia" w:hAnsi="Times New Roman" w:cs="Times New Roman"/>
           <w:b/>
@@ -25,21 +25,23 @@
           <w:color w:val="000000" w:themeColor="text1"/>
         </w:rPr>
       </w:pPr>
-      <w:r>
+    </w:p>
+    <w:p>
+      <w:pPr>
+        <w:spacing w:after="0" w:line="480" w:lineRule="auto"/>
+        <w:jc w:val="center"/>
         <w:rPr>
           <w:rFonts w:ascii="Times New Roman" w:eastAsiaTheme="majorEastAsia" w:hAnsi="Times New Roman" w:cs="Times New Roman"/>
           <w:b/>
           <w:bCs/>
           <w:color w:val="000000" w:themeColor="text1"/>
         </w:rPr>
-        <w:t>Executive Summary: Climate Trends and Logistics Risk</w:t>
-      </w:r>
+      </w:pPr>
     </w:p>
     <w:p>
       <w:pPr>
         <w:spacing w:after="0" w:line="480" w:lineRule="auto"/>
-        <w:ind w:left="2880" w:firstLine="720"/>
-        <w:jc w:val="both"/>
+        <w:jc w:val="center"/>
         <w:rPr>
           <w:rFonts w:ascii="Times New Roman" w:eastAsiaTheme="majorEastAsia" w:hAnsi="Times New Roman" w:cs="Times New Roman"/>
           <w:b/>
@@ -51,16 +53,28 @@
     <w:p>
       <w:pPr>
         <w:spacing w:after="0" w:line="480" w:lineRule="auto"/>
-        <w:jc w:val="both"/>
-        <w:rPr>
-          <w:color w:val="000000" w:themeColor="text1"/>
-        </w:rPr>
-      </w:pPr>
+        <w:jc w:val="center"/>
+        <w:rPr>
+          <w:rFonts w:ascii="Times New Roman" w:eastAsiaTheme="majorEastAsia" w:hAnsi="Times New Roman" w:cs="Times New Roman"/>
+          <w:b/>
+          <w:bCs/>
+          <w:color w:val="000000" w:themeColor="text1"/>
+        </w:rPr>
+      </w:pPr>
+      <w:r>
+        <w:rPr>
+          <w:rFonts w:ascii="Times New Roman" w:eastAsiaTheme="majorEastAsia" w:hAnsi="Times New Roman" w:cs="Times New Roman"/>
+          <w:b/>
+          <w:bCs/>
+          <w:color w:val="000000" w:themeColor="text1"/>
+        </w:rPr>
+        <w:t>Executive Summary: Climate Trends and Logistics Risk</w:t>
+      </w:r>
     </w:p>
     <w:p>
       <w:pPr>
         <w:spacing w:after="0" w:line="480" w:lineRule="auto"/>
-        <w:jc w:val="both"/>
+        <w:jc w:val="center"/>
         <w:rPr>
           <w:color w:val="000000" w:themeColor="text1"/>
         </w:rPr>
@@ -69,128 +83,161 @@
     <w:p>
       <w:pPr>
         <w:spacing w:after="0" w:line="480" w:lineRule="auto"/>
-        <w:jc w:val="both"/>
-        <w:rPr>
-          <w:color w:val="000000" w:themeColor="text1"/>
-        </w:rPr>
-      </w:pPr>
+        <w:jc w:val="center"/>
+        <w:rPr>
+          <w:color w:val="000000" w:themeColor="text1"/>
+        </w:rPr>
+      </w:pPr>
+      <w:r>
+        <w:rPr>
+          <w:color w:val="000000" w:themeColor="text1"/>
+        </w:rPr>
+        <w:t>Kashav Piya</w:t>
+      </w:r>
     </w:p>
     <w:p>
       <w:pPr>
         <w:spacing w:after="0" w:line="480" w:lineRule="auto"/>
-        <w:jc w:val="both"/>
-        <w:rPr>
-          <w:color w:val="000000" w:themeColor="text1"/>
-        </w:rPr>
-      </w:pPr>
+        <w:jc w:val="center"/>
+        <w:rPr>
+          <w:color w:val="000000" w:themeColor="text1"/>
+        </w:rPr>
+      </w:pPr>
+      <w:r>
+        <w:rPr>
+          <w:color w:val="000000" w:themeColor="text1"/>
+        </w:rPr>
+        <w:t>Avinash Goud Parkala</w:t>
+      </w:r>
     </w:p>
     <w:p>
       <w:pPr>
         <w:spacing w:after="0" w:line="480" w:lineRule="auto"/>
-        <w:jc w:val="both"/>
-        <w:rPr>
-          <w:color w:val="000000" w:themeColor="text1"/>
-        </w:rPr>
-      </w:pPr>
+        <w:jc w:val="center"/>
+        <w:rPr>
+          <w:color w:val="000000" w:themeColor="text1"/>
+        </w:rPr>
+      </w:pPr>
+      <w:r>
+        <w:rPr>
+          <w:color w:val="000000" w:themeColor="text1"/>
+        </w:rPr>
+        <w:t>Amey Pawar</w:t>
+      </w:r>
     </w:p>
     <w:p>
       <w:pPr>
         <w:spacing w:after="0" w:line="480" w:lineRule="auto"/>
-        <w:jc w:val="both"/>
-        <w:rPr>
-          <w:color w:val="000000" w:themeColor="text1"/>
-        </w:rPr>
-      </w:pPr>
-      <w:r>
-        <w:rPr>
-          <w:color w:val="000000" w:themeColor="text1"/>
-        </w:rPr>
-        <w:t>Kashav Piya</w:t>
+        <w:jc w:val="center"/>
+        <w:rPr>
+          <w:color w:val="000000" w:themeColor="text1"/>
+        </w:rPr>
+      </w:pPr>
+      <w:r>
+        <w:rPr>
+          <w:color w:val="000000" w:themeColor="text1"/>
+        </w:rPr>
+        <w:t>Anjana Susmitha Penmatsa</w:t>
       </w:r>
     </w:p>
     <w:p>
       <w:pPr>
         <w:spacing w:after="0" w:line="480" w:lineRule="auto"/>
-        <w:jc w:val="both"/>
-        <w:rPr>
-          <w:color w:val="000000" w:themeColor="text1"/>
-        </w:rPr>
-      </w:pPr>
-      <w:r>
-        <w:rPr>
-          <w:color w:val="000000" w:themeColor="text1"/>
-        </w:rPr>
-        <w:t>Avinash Goud Parkala</w:t>
+        <w:jc w:val="center"/>
+        <w:rPr>
+          <w:color w:val="000000" w:themeColor="text1"/>
+        </w:rPr>
+      </w:pPr>
+      <w:r>
+        <w:rPr>
+          <w:color w:val="000000" w:themeColor="text1"/>
+        </w:rPr>
+        <w:t>Vijay Sai Krishna Penugonda</w:t>
       </w:r>
     </w:p>
     <w:p>
       <w:pPr>
         <w:spacing w:after="0" w:line="480" w:lineRule="auto"/>
-        <w:jc w:val="both"/>
-        <w:rPr>
-          <w:color w:val="000000" w:themeColor="text1"/>
-        </w:rPr>
-      </w:pPr>
-      <w:r>
-        <w:rPr>
-          <w:color w:val="000000" w:themeColor="text1"/>
-        </w:rPr>
-        <w:t>Amey Pawar</w:t>
+        <w:jc w:val="center"/>
+        <w:rPr>
+          <w:color w:val="000000" w:themeColor="text1"/>
+        </w:rPr>
+      </w:pPr>
+      <w:r>
+        <w:rPr>
+          <w:color w:val="000000" w:themeColor="text1"/>
+        </w:rPr>
+        <w:t>Bhargavi Ponnuru</w:t>
       </w:r>
     </w:p>
     <w:p>
       <w:pPr>
         <w:spacing w:after="0" w:line="480" w:lineRule="auto"/>
-        <w:jc w:val="both"/>
-        <w:rPr>
-          <w:color w:val="000000" w:themeColor="text1"/>
-        </w:rPr>
-      </w:pPr>
-      <w:r>
-        <w:rPr>
-          <w:color w:val="000000" w:themeColor="text1"/>
-        </w:rPr>
-        <w:t>Anjana Susmitha Penmatsa</w:t>
-      </w:r>
-    </w:p>
-    <w:p>
-      <w:pPr>
-        <w:spacing w:after="0" w:line="480" w:lineRule="auto"/>
-        <w:jc w:val="both"/>
-        <w:rPr>
-          <w:color w:val="000000" w:themeColor="text1"/>
-        </w:rPr>
-      </w:pPr>
-      <w:r>
-        <w:rPr>
-          <w:color w:val="000000" w:themeColor="text1"/>
-        </w:rPr>
-        <w:t>Vijay Sai Krishna Penugonda</w:t>
-      </w:r>
-    </w:p>
-    <w:p>
-      <w:pPr>
-        <w:spacing w:after="0" w:line="480" w:lineRule="auto"/>
-        <w:jc w:val="both"/>
-        <w:rPr>
-          <w:color w:val="000000" w:themeColor="text1"/>
-        </w:rPr>
-      </w:pPr>
-      <w:r>
-        <w:rPr>
-          <w:color w:val="000000" w:themeColor="text1"/>
-        </w:rPr>
-        <w:t>Bhargavi Ponnuru</w:t>
-      </w:r>
-    </w:p>
-    <w:p>
-      <w:pPr>
-        <w:spacing w:after="0" w:line="480" w:lineRule="auto"/>
-        <w:jc w:val="both"/>
-        <w:rPr>
-          <w:color w:val="000000" w:themeColor="text1"/>
-        </w:rPr>
-      </w:pPr>
+        <w:jc w:val="center"/>
+        <w:rPr>
+          <w:color w:val="000000" w:themeColor="text1"/>
+        </w:rPr>
+      </w:pPr>
+    </w:p>
+    <w:p>
+      <w:pPr>
+        <w:spacing w:line="480" w:lineRule="auto"/>
+        <w:jc w:val="center"/>
+        <w:rPr>
+          <w:rFonts w:ascii="Times New Roman" w:hAnsi="Times New Roman" w:cs="Times New Roman"/>
+        </w:rPr>
+      </w:pPr>
+      <w:r>
+        <w:rPr>
+          <w:rFonts w:ascii="Times New Roman" w:hAnsi="Times New Roman" w:cs="Times New Roman"/>
+        </w:rPr>
+        <w:t>Indiana Wesleyan University</w:t>
+      </w:r>
+    </w:p>
+    <w:p>
+      <w:pPr>
+        <w:spacing w:line="480" w:lineRule="auto"/>
+        <w:jc w:val="center"/>
+        <w:rPr>
+          <w:rFonts w:ascii="Times New Roman" w:hAnsi="Times New Roman" w:cs="Times New Roman"/>
+        </w:rPr>
+      </w:pPr>
+      <w:r>
+        <w:rPr>
+          <w:rFonts w:ascii="Times New Roman" w:hAnsi="Times New Roman" w:cs="Times New Roman"/>
+        </w:rPr>
+        <w:t>DTAN-505: Data Visualization</w:t>
+      </w:r>
+    </w:p>
+    <w:p>
+      <w:pPr>
+        <w:spacing w:line="480" w:lineRule="auto"/>
+        <w:jc w:val="center"/>
+        <w:rPr>
+          <w:rFonts w:ascii="Times New Roman" w:hAnsi="Times New Roman" w:cs="Times New Roman"/>
+        </w:rPr>
+      </w:pPr>
+      <w:r>
+        <w:rPr>
+          <w:rFonts w:ascii="Times New Roman" w:hAnsi="Times New Roman" w:cs="Times New Roman"/>
+        </w:rPr>
+        <w:t>Professor Frank Zeng</w:t>
+      </w:r>
+    </w:p>
+    <w:p>
+      <w:pPr>
+        <w:spacing w:line="480" w:lineRule="auto"/>
+        <w:jc w:val="center"/>
+        <w:rPr>
+          <w:rFonts w:ascii="Times New Roman" w:hAnsi="Times New Roman" w:cs="Times New Roman"/>
+        </w:rPr>
+      </w:pPr>
+      <w:r>
+        <w:rPr>
+          <w:rFonts w:ascii="Times New Roman" w:hAnsi="Times New Roman" w:cs="Times New Roman"/>
+        </w:rPr>
+        <w:t>October 13, 2026</w:t>
+      </w:r>
     </w:p>
     <w:p>
       <w:pPr>

</xml_diff>